<commit_message>
New features: Route Stickness, Handoff, Clarification, Read-Only/Transactional, Long Term Memory
</commit_message>
<xml_diff>
--- a/Documentacao/Manual_Desenvolvedor_AI_Agent_Framework_OCI.docx
+++ b/Documentacao/Manual_Desenvolvedor_AI_Agent_Framework_OCI.docx
@@ -26796,6 +26796,98 @@
     <w:p>
       <w:r>
         <w:t>7. Dados sensíveis devem ser mascarados antes de logs, traces e streaming.</w:t>
+      </w:r>
+    </w:p>
+    <w:p>
+      <w:r>
+        <w:br w:type="page"/>
+      </w:r>
+    </w:p>
+    <w:p>
+      <w:pPr>
+        <w:pStyle w:val="Ttulo1"/>
+      </w:pPr>
+      <w:r>
+        <w:t>Políticas read-only e transacionais</w:t>
+      </w:r>
+    </w:p>
+    <w:p>
+      <w:r>
+        <w:t>O framework aplica uma política conversacional mínima imediatamente antes da chamada MCP. A classificação read_only identifica consultas; transactional identifica operações que alteram estado. Autorização, idempotência, validação e atomicidade continuam sob responsabilidade do MCP Server.</w:t>
+      </w:r>
+    </w:p>
+    <w:p>
+      <w:pPr>
+        <w:pStyle w:val="Ttulo2"/>
+      </w:pPr>
+      <w:r>
+        <w:t>Configuração no backend</w:t>
+      </w:r>
+    </w:p>
+    <w:p>
+      <w:r>
+        <w:t>A configuração é opcional e fica em config/tool_policies.yaml no agent_template_backend. O caminho pode ser definido por TOOL_POLICIES_PATH. Não coloque políticas de domínio dentro da biblioteca compartilhada.</w:t>
+      </w:r>
+    </w:p>
+    <w:p>
+      <w:r>
+        <w:t>Exemplo:</w:t>
+        <w:br/>
+        <w:t>defaults:</w:t>
+        <w:br/>
+        <w:t xml:space="preserve">  operation_type: read_only</w:t>
+        <w:br/>
+        <w:t xml:space="preserve">  require_confirmation: false</w:t>
+        <w:br/>
+        <w:t>tool_policies:</w:t>
+        <w:br/>
+        <w:t xml:space="preserve">  alterar_plano:</w:t>
+        <w:br/>
+        <w:t xml:space="preserve">    operation_type: transactional</w:t>
+        <w:br/>
+        <w:t xml:space="preserve">    require_confirmation: true</w:t>
+        <w:br/>
+        <w:t xml:space="preserve">    requires: [new_plan_id]</w:t>
+      </w:r>
+    </w:p>
+    <w:p>
+      <w:pPr>
+        <w:pStyle w:val="Ttulo2"/>
+      </w:pPr>
+      <w:r>
+        <w:t>Execução e compatibilidade</w:t>
+      </w:r>
+    </w:p>
+    <w:p>
+      <w:pPr>
+        <w:pStyle w:val="Commarcadores"/>
+      </w:pPr>
+      <w:r>
+        <w:t>A confirmação deve chegar como confirmed: true ou confirmation: true; texto com valor true não é suficiente.</w:t>
+      </w:r>
+    </w:p>
+    <w:p>
+      <w:pPr>
+        <w:pStyle w:val="Commarcadores"/>
+      </w:pPr>
+      <w:r>
+        <w:t>Se tool_policies.yaml não existir, permanecem válidos tool_type, requires, confirmation_required e execution_policy de tools.yaml.</w:t>
+      </w:r>
+    </w:p>
+    <w:p>
+      <w:pPr>
+        <w:pStyle w:val="Commarcadores"/>
+      </w:pPr>
+      <w:r>
+        <w:t>Tools antigas sem política continuam funcionando sem alteração de comportamento.</w:t>
+      </w:r>
+    </w:p>
+    <w:p>
+      <w:pPr>
+        <w:pStyle w:val="Commarcadores"/>
+      </w:pPr>
+      <w:r>
+        <w:t>Uma chamada bloqueada não alcança o MCP e retorna metadados blocked_by_policy, operation_type e policy_source.</w:t>
       </w:r>
     </w:p>
     <w:sectPr>

</xml_diff>